<commit_message>
Update README, documentation and billing payment logic
</commit_message>
<xml_diff>
--- a/HMS_Project_Report.docx
+++ b/HMS_Project_Report.docx
@@ -1,5 +1,51 @@
 
-<file path=word/document.xml><?xml version="1.0" encoding="utf-8"?>
+<file path=docProps\app.xml><?xml version="1.0" encoding="utf-8"?>
+<Properties xmlns="http://schemas.openxmlformats.org/officeDocument/2006/extended-properties" xmlns:vt="http://schemas.openxmlformats.org/officeDocument/2006/docPropsVTypes">
+  <Template>Normal.dotm</Template>
+  <TotalTime>23</TotalTime>
+  <Pages>9</Pages>
+  <Words>652</Words>
+  <Characters>3719</Characters>
+  <Application>Microsoft Office Word</Application>
+  <DocSecurity>0</DocSecurity>
+  <Lines>30</Lines>
+  <Paragraphs>8</Paragraphs>
+  <ScaleCrop>false</ScaleCrop>
+  <HeadingPairs>
+    <vt:vector size="2" baseType="variant">
+      <vt:variant>
+        <vt:lpstr>Title</vt:lpstr>
+      </vt:variant>
+      <vt:variant>
+        <vt:i4>1</vt:i4>
+      </vt:variant>
+    </vt:vector>
+  </HeadingPairs>
+  <TitlesOfParts>
+    <vt:vector size="1" baseType="lpstr">
+      <vt:lpstr/>
+    </vt:vector>
+  </TitlesOfParts>
+  <Company/>
+  <LinksUpToDate>false</LinksUpToDate>
+  <CharactersWithSpaces>4363</CharactersWithSpaces>
+  <SharedDoc>false</SharedDoc>
+  <HyperlinksChanged>false</HyperlinksChanged>
+  <AppVersion>16.0000</AppVersion>
+</Properties>
+</file>
+
+<file path=docProps\core.xml><?xml version="1.0" encoding="utf-8"?>
+<cp:coreProperties xmlns:cp="http://schemas.openxmlformats.org/package/2006/metadata/core-properties" xmlns:dc="http://purl.org/dc/elements/1.1/" xmlns:dcterms="http://purl.org/dc/terms/" xmlns:dcmitype="http://purl.org/dc/dcmitype/" xmlns:xsi="http://www.w3.org/2001/XMLSchema-instance">
+  <dc:creator>Un-named</dc:creator>
+  <cp:lastModifiedBy>Suleman Saqib</cp:lastModifiedBy>
+  <cp:revision>2</cp:revision>
+  <dcterms:created xsi:type="dcterms:W3CDTF">2026-05-16T05:50:00Z</dcterms:created>
+  <dcterms:modified xsi:type="dcterms:W3CDTF">2026-05-16T06:16:00Z</dcterms:modified>
+</cp:coreProperties>
+</file>
+
+<file path=word\document.xml><?xml version="1.0" encoding="utf-8"?>
 <w:document xmlns:wpc="http://schemas.microsoft.com/office/word/2010/wordprocessingCanvas" xmlns:cx="http://schemas.microsoft.com/office/drawing/2014/chartex" xmlns:cx1="http://schemas.microsoft.com/office/drawing/2015/9/8/chartex" xmlns:cx2="http://schemas.microsoft.com/office/drawing/2015/10/21/chartex" xmlns:cx3="http://schemas.microsoft.com/office/drawing/2016/5/9/chartex" xmlns:cx4="http://schemas.microsoft.com/office/drawing/2016/5/10/chartex" xmlns:cx5="http://schemas.microsoft.com/office/drawing/2016/5/11/chartex" xmlns:cx6="http://schemas.microsoft.com/office/drawing/2016/5/12/chartex" xmlns:cx7="http://schemas.microsoft.com/office/drawing/2016/5/13/chartex" xmlns:cx8="http://schemas.microsoft.com/office/drawing/2016/5/14/chartex" xmlns:mc="http://schemas.openxmlformats.org/markup-compatibility/2006" xmlns:aink="http://schemas.microsoft.com/office/drawing/2016/ink" xmlns:am3d="http://schemas.microsoft.com/office/drawing/2017/model3d" xmlns:o="urn:schemas-microsoft-com:office:office" xmlns:r="http://schemas.openxmlformats.org/officeDocument/2006/relationships" xmlns:m="http://schemas.openxmlformats.org/officeDocument/2006/math" xmlns:v="urn:schemas-microsoft-com:vml" xmlns:wp14="http://schemas.microsoft.com/office/word/2010/wordprocessingDrawing" xmlns:wp="http://schemas.openxmlformats.org/drawingml/2006/wordprocessingDrawing" xmlns:w10="urn:schemas-microsoft-com:office:word" xmlns:w="http://schemas.openxmlformats.org/wordprocessingml/2006/main" xmlns:w14="http://schemas.microsoft.com/office/word/2010/wordml" xmlns:w15="http://schemas.microsoft.com/office/word/2012/wordml" xmlns:w16cid="http://schemas.microsoft.com/office/word/2016/wordml/cid" xmlns:w16se="http://schemas.microsoft.com/office/word/2015/wordml/symex" xmlns:wpg="http://schemas.microsoft.com/office/word/2010/wordprocessingGroup" xmlns:wpi="http://schemas.microsoft.com/office/word/2010/wordprocessingInk" xmlns:wne="http://schemas.microsoft.com/office/word/2006/wordml" xmlns:wps="http://schemas.microsoft.com/office/word/2010/wordprocessingShape" mc:Ignorable="w14 w15 w16se w16cid wp14">
   <w:body>
     <w:p>
@@ -2526,6 +2572,79 @@
         <w:spacing w:after="80"/>
       </w:pPr>
     </w:p>
+    <w:p xmlns:w="http://schemas.openxmlformats.org/wordprocessingml/2006/main">
+      <w:pPr>
+        <w:pStyle w:val="Heading2"/>
+      </w:pPr>
+      <w:r>
+        <w:t>5.1 Database PL/SQL Objects &amp; Optimizations</w:t>
+      </w:r>
+    </w:p>
+    <w:p xmlns:w="http://schemas.openxmlformats.org/wordprocessingml/2006/main">
+      <w:r>
+        <w:t>To enhance security, enforce business rules directly at the data layer, and optimize query latency, the database layer was upgraded with PL/SQL database objects including Views, Stored Procedures, Cursors, Triggers, and Exception Handling.</w:t>
+      </w:r>
+    </w:p>
+    <w:p xmlns:w="http://schemas.openxmlformats.org/wordprocessingml/2006/main">
+      <w:r>
+        <w:rPr>
+          <w:b/>
+        </w:rPr>
+        <w:t>Database Views</w:t>
+      </w:r>
+    </w:p>
+    <w:p xmlns:w="http://schemas.openxmlformats.org/wordprocessingml/2006/main">
+      <w:r>
+        <w:t>- patient_details_v: Left-joins patients with their active admission status, current bed/ward details, and their attending doctor name to simplify frontend views.</w:t>
+      </w:r>
+    </w:p>
+    <w:p xmlns:w="http://schemas.openxmlformats.org/wordprocessingml/2006/main">
+      <w:r>
+        <w:t>- appointment_details_v: Merges appointments with patient profile details, doctor designations, and departments for cleaner list retrieves.</w:t>
+      </w:r>
+    </w:p>
+    <w:p xmlns:w="http://schemas.openxmlformats.org/wordprocessingml/2006/main">
+      <w:r>
+        <w:t>- billing_summary_v: Combines patient billing records with contact info and dynamically computes remaining invoice balances.</w:t>
+      </w:r>
+    </w:p>
+    <w:p xmlns:w="http://schemas.openxmlformats.org/wordprocessingml/2006/main">
+      <w:r>
+        <w:t>- medicine_inventory_v: Categorizes stock levels into 'ok', 'low', or 'out_of_stock' status based on min_quantity thresholds.</w:t>
+      </w:r>
+    </w:p>
+    <w:p xmlns:w="http://schemas.openxmlformats.org/wordprocessingml/2006/main">
+      <w:r>
+        <w:rPr>
+          <w:b/>
+        </w:rPr>
+        <w:t>Stored Procedures with Cursors &amp; Custom Exception Handling</w:t>
+      </w:r>
+    </w:p>
+    <w:p xmlns:w="http://schemas.openxmlformats.org/wordprocessingml/2006/main">
+      <w:r>
+        <w:t>- sp_add_prescription: A transactional procedure that validates patients, checks doctor active status, validates medicine stock, inserts the prescription, and decrements stock. If stock is insufficient, it raises a custom application error (-20001) that is trapped and handled by the Node.js API.</w:t>
+      </w:r>
+    </w:p>
+    <w:p xmlns:w="http://schemas.openxmlformats.org/wordprocessingml/2006/main">
+      <w:r>
+        <w:t>- sp_discharge_patient: Automatically discharges an inpatient and calculates room, appointment, and pharmacy charges. It uses Cursors to aggregate all related treatments, calculate the room charge based on stay duration, and automatically insert the corresponding billing record.</w:t>
+      </w:r>
+    </w:p>
+    <w:p xmlns:w="http://schemas.openxmlformats.org/wordprocessingml/2006/main">
+      <w:r>
+        <w:rPr>
+          <w:b/>
+        </w:rPr>
+        <w:t>Database Triggers</w:t>
+      </w:r>
+    </w:p>
+    <w:p xmlns:w="http://schemas.openxmlformats.org/wordprocessingml/2006/main">
+      <w:r>
+        <w:t>- trg_update_billing_status: A BEFORE INSERT OR UPDATE trigger on the billing table that automatically calculates and sets status ('paid', 'partial', 'pending') based on paid_amount versus total_amount, removing redundancy in Node.js controller files.</w:t>
+      </w:r>
+    </w:p>
+    <w:p xmlns:w="http://schemas.openxmlformats.org/wordprocessingml/2006/main"/>
     <w:p>
       <w:pPr>
         <w:pStyle w:val="Heading1"/>
@@ -4348,7 +4467,7 @@
 </w:document>
 </file>
 
-<file path=word/endnotes.xml><?xml version="1.0" encoding="utf-8"?>
+<file path=word\endnotes.xml><?xml version="1.0" encoding="utf-8"?>
 <w:endnotes xmlns:wpc="http://schemas.microsoft.com/office/word/2010/wordprocessingCanvas" xmlns:cx="http://schemas.microsoft.com/office/drawing/2014/chartex" xmlns:cx1="http://schemas.microsoft.com/office/drawing/2015/9/8/chartex" xmlns:cx2="http://schemas.microsoft.com/office/drawing/2015/10/21/chartex" xmlns:cx3="http://schemas.microsoft.com/office/drawing/2016/5/9/chartex" xmlns:cx4="http://schemas.microsoft.com/office/drawing/2016/5/10/chartex" xmlns:cx5="http://schemas.microsoft.com/office/drawing/2016/5/11/chartex" xmlns:cx6="http://schemas.microsoft.com/office/drawing/2016/5/12/chartex" xmlns:cx7="http://schemas.microsoft.com/office/drawing/2016/5/13/chartex" xmlns:cx8="http://schemas.microsoft.com/office/drawing/2016/5/14/chartex" xmlns:mc="http://schemas.openxmlformats.org/markup-compatibility/2006" xmlns:aink="http://schemas.microsoft.com/office/drawing/2016/ink" xmlns:am3d="http://schemas.microsoft.com/office/drawing/2017/model3d" xmlns:o="urn:schemas-microsoft-com:office:office" xmlns:r="http://schemas.openxmlformats.org/officeDocument/2006/relationships" xmlns:m="http://schemas.openxmlformats.org/officeDocument/2006/math" xmlns:v="urn:schemas-microsoft-com:vml" xmlns:wp14="http://schemas.microsoft.com/office/word/2010/wordprocessingDrawing" xmlns:wp="http://schemas.openxmlformats.org/drawingml/2006/wordprocessingDrawing" xmlns:w10="urn:schemas-microsoft-com:office:word" xmlns:w="http://schemas.openxmlformats.org/wordprocessingml/2006/main" xmlns:w14="http://schemas.microsoft.com/office/word/2010/wordml" xmlns:w15="http://schemas.microsoft.com/office/word/2012/wordml" xmlns:w16cid="http://schemas.microsoft.com/office/word/2016/wordml/cid" xmlns:w16se="http://schemas.microsoft.com/office/word/2015/wordml/symex" xmlns:wpg="http://schemas.microsoft.com/office/word/2010/wordprocessingGroup" xmlns:wpi="http://schemas.microsoft.com/office/word/2010/wordprocessingInk" xmlns:wne="http://schemas.microsoft.com/office/word/2006/wordml" xmlns:wps="http://schemas.microsoft.com/office/word/2010/wordprocessingShape" mc:Ignorable="w14 w15 w16se w16cid wp14">
   <w:endnote w:type="separator" w:id="-1">
     <w:p>
@@ -4367,7 +4486,40 @@
 </w:endnotes>
 </file>
 
-<file path=word/footer1.xml><?xml version="1.0" encoding="utf-8"?>
+<file path=word\fontTable.xml><?xml version="1.0" encoding="utf-8"?>
+<w:fonts xmlns:mc="http://schemas.openxmlformats.org/markup-compatibility/2006" xmlns:r="http://schemas.openxmlformats.org/officeDocument/2006/relationships" xmlns:w="http://schemas.openxmlformats.org/wordprocessingml/2006/main" xmlns:w14="http://schemas.microsoft.com/office/word/2010/wordml" xmlns:w15="http://schemas.microsoft.com/office/word/2012/wordml" xmlns:w16cid="http://schemas.microsoft.com/office/word/2016/wordml/cid" xmlns:w16se="http://schemas.microsoft.com/office/word/2015/wordml/symex" mc:Ignorable="w14 w15 w16se w16cid">
+  <w:font w:name="Arial">
+    <w:panose1 w:val="020B0604020202020204"/>
+    <w:charset w:val="00"/>
+    <w:family w:val="swiss"/>
+    <w:pitch w:val="variable"/>
+    <w:sig w:usb0="E0002EFF" w:usb1="C000785B" w:usb2="00000009" w:usb3="00000000" w:csb0="000001FF" w:csb1="00000000"/>
+  </w:font>
+  <w:font w:name="Times New Roman">
+    <w:panose1 w:val="02020603050405020304"/>
+    <w:charset w:val="00"/>
+    <w:family w:val="roman"/>
+    <w:pitch w:val="variable"/>
+    <w:sig w:usb0="E0002EFF" w:usb1="C000785B" w:usb2="00000009" w:usb3="00000000" w:csb0="000001FF" w:csb1="00000000"/>
+  </w:font>
+  <w:font w:name="Calibri Light">
+    <w:panose1 w:val="020F0302020204030204"/>
+    <w:charset w:val="00"/>
+    <w:family w:val="swiss"/>
+    <w:pitch w:val="variable"/>
+    <w:sig w:usb0="E4002EFF" w:usb1="C000247B" w:usb2="00000009" w:usb3="00000000" w:csb0="000001FF" w:csb1="00000000"/>
+  </w:font>
+  <w:font w:name="Calibri">
+    <w:panose1 w:val="020F0502020204030204"/>
+    <w:charset w:val="00"/>
+    <w:family w:val="swiss"/>
+    <w:pitch w:val="variable"/>
+    <w:sig w:usb0="E4002EFF" w:usb1="C000247B" w:usb2="00000009" w:usb3="00000000" w:csb0="000001FF" w:csb1="00000000"/>
+  </w:font>
+</w:fonts>
+</file>
+
+<file path=word\footer1.xml><?xml version="1.0" encoding="utf-8"?>
 <w:ftr xmlns:wpc="http://schemas.microsoft.com/office/word/2010/wordprocessingCanvas" xmlns:cx="http://schemas.microsoft.com/office/drawing/2014/chartex" xmlns:cx1="http://schemas.microsoft.com/office/drawing/2015/9/8/chartex" xmlns:cx2="http://schemas.microsoft.com/office/drawing/2015/10/21/chartex" xmlns:cx3="http://schemas.microsoft.com/office/drawing/2016/5/9/chartex" xmlns:cx4="http://schemas.microsoft.com/office/drawing/2016/5/10/chartex" xmlns:cx5="http://schemas.microsoft.com/office/drawing/2016/5/11/chartex" xmlns:cx6="http://schemas.microsoft.com/office/drawing/2016/5/12/chartex" xmlns:cx7="http://schemas.microsoft.com/office/drawing/2016/5/13/chartex" xmlns:cx8="http://schemas.microsoft.com/office/drawing/2016/5/14/chartex" xmlns:mc="http://schemas.openxmlformats.org/markup-compatibility/2006" xmlns:aink="http://schemas.microsoft.com/office/drawing/2016/ink" xmlns:am3d="http://schemas.microsoft.com/office/drawing/2017/model3d" xmlns:o="urn:schemas-microsoft-com:office:office" xmlns:r="http://schemas.openxmlformats.org/officeDocument/2006/relationships" xmlns:m="http://schemas.openxmlformats.org/officeDocument/2006/math" xmlns:v="urn:schemas-microsoft-com:vml" xmlns:wp14="http://schemas.microsoft.com/office/word/2010/wordprocessingDrawing" xmlns:wp="http://schemas.openxmlformats.org/drawingml/2006/wordprocessingDrawing" xmlns:w10="urn:schemas-microsoft-com:office:word" xmlns:w="http://schemas.openxmlformats.org/wordprocessingml/2006/main" xmlns:w14="http://schemas.microsoft.com/office/word/2010/wordml" xmlns:w15="http://schemas.microsoft.com/office/word/2012/wordml" xmlns:w16cid="http://schemas.microsoft.com/office/word/2016/wordml/cid" xmlns:w16se="http://schemas.microsoft.com/office/word/2015/wordml/symex" xmlns:wpg="http://schemas.microsoft.com/office/word/2010/wordprocessingGroup" xmlns:wpi="http://schemas.microsoft.com/office/word/2010/wordprocessingInk" xmlns:wne="http://schemas.microsoft.com/office/word/2006/wordml" xmlns:wps="http://schemas.microsoft.com/office/word/2010/wordprocessingShape" mc:Ignorable="w14 w15 w16se w16cid wp14">
   <w:p>
     <w:pPr>
@@ -4388,7 +4540,7 @@
 </w:ftr>
 </file>
 
-<file path=word/footnotes.xml><?xml version="1.0" encoding="utf-8"?>
+<file path=word\footnotes.xml><?xml version="1.0" encoding="utf-8"?>
 <w:footnotes xmlns:wpc="http://schemas.microsoft.com/office/word/2010/wordprocessingCanvas" xmlns:cx="http://schemas.microsoft.com/office/drawing/2014/chartex" xmlns:cx1="http://schemas.microsoft.com/office/drawing/2015/9/8/chartex" xmlns:cx2="http://schemas.microsoft.com/office/drawing/2015/10/21/chartex" xmlns:cx3="http://schemas.microsoft.com/office/drawing/2016/5/9/chartex" xmlns:cx4="http://schemas.microsoft.com/office/drawing/2016/5/10/chartex" xmlns:cx5="http://schemas.microsoft.com/office/drawing/2016/5/11/chartex" xmlns:cx6="http://schemas.microsoft.com/office/drawing/2016/5/12/chartex" xmlns:cx7="http://schemas.microsoft.com/office/drawing/2016/5/13/chartex" xmlns:cx8="http://schemas.microsoft.com/office/drawing/2016/5/14/chartex" xmlns:mc="http://schemas.openxmlformats.org/markup-compatibility/2006" xmlns:aink="http://schemas.microsoft.com/office/drawing/2016/ink" xmlns:am3d="http://schemas.microsoft.com/office/drawing/2017/model3d" xmlns:o="urn:schemas-microsoft-com:office:office" xmlns:r="http://schemas.openxmlformats.org/officeDocument/2006/relationships" xmlns:m="http://schemas.openxmlformats.org/officeDocument/2006/math" xmlns:v="urn:schemas-microsoft-com:vml" xmlns:wp14="http://schemas.microsoft.com/office/word/2010/wordprocessingDrawing" xmlns:wp="http://schemas.openxmlformats.org/drawingml/2006/wordprocessingDrawing" xmlns:w10="urn:schemas-microsoft-com:office:word" xmlns:w="http://schemas.openxmlformats.org/wordprocessingml/2006/main" xmlns:w14="http://schemas.microsoft.com/office/word/2010/wordml" xmlns:w15="http://schemas.microsoft.com/office/word/2012/wordml" xmlns:w16cid="http://schemas.microsoft.com/office/word/2016/wordml/cid" xmlns:w16se="http://schemas.microsoft.com/office/word/2015/wordml/symex" xmlns:wpg="http://schemas.microsoft.com/office/word/2010/wordprocessingGroup" xmlns:wpi="http://schemas.microsoft.com/office/word/2010/wordprocessingInk" xmlns:wne="http://schemas.microsoft.com/office/word/2006/wordml" xmlns:wps="http://schemas.microsoft.com/office/word/2010/wordprocessingShape" mc:Ignorable="w14 w15 w16se w16cid wp14">
   <w:footnote w:type="separator" w:id="-1">
     <w:p>
@@ -4407,7 +4559,7 @@
 </w:footnotes>
 </file>
 
-<file path=word/header1.xml><?xml version="1.0" encoding="utf-8"?>
+<file path=word\header1.xml><?xml version="1.0" encoding="utf-8"?>
 <w:hdr xmlns:wpc="http://schemas.microsoft.com/office/word/2010/wordprocessingCanvas" xmlns:cx="http://schemas.microsoft.com/office/drawing/2014/chartex" xmlns:cx1="http://schemas.microsoft.com/office/drawing/2015/9/8/chartex" xmlns:cx2="http://schemas.microsoft.com/office/drawing/2015/10/21/chartex" xmlns:cx3="http://schemas.microsoft.com/office/drawing/2016/5/9/chartex" xmlns:cx4="http://schemas.microsoft.com/office/drawing/2016/5/10/chartex" xmlns:cx5="http://schemas.microsoft.com/office/drawing/2016/5/11/chartex" xmlns:cx6="http://schemas.microsoft.com/office/drawing/2016/5/12/chartex" xmlns:cx7="http://schemas.microsoft.com/office/drawing/2016/5/13/chartex" xmlns:cx8="http://schemas.microsoft.com/office/drawing/2016/5/14/chartex" xmlns:mc="http://schemas.openxmlformats.org/markup-compatibility/2006" xmlns:aink="http://schemas.microsoft.com/office/drawing/2016/ink" xmlns:am3d="http://schemas.microsoft.com/office/drawing/2017/model3d" xmlns:o="urn:schemas-microsoft-com:office:office" xmlns:r="http://schemas.openxmlformats.org/officeDocument/2006/relationships" xmlns:m="http://schemas.openxmlformats.org/officeDocument/2006/math" xmlns:v="urn:schemas-microsoft-com:vml" xmlns:wp14="http://schemas.microsoft.com/office/word/2010/wordprocessingDrawing" xmlns:wp="http://schemas.openxmlformats.org/drawingml/2006/wordprocessingDrawing" xmlns:w10="urn:schemas-microsoft-com:office:word" xmlns:w="http://schemas.openxmlformats.org/wordprocessingml/2006/main" xmlns:w14="http://schemas.microsoft.com/office/word/2010/wordml" xmlns:w15="http://schemas.microsoft.com/office/word/2012/wordml" xmlns:w16cid="http://schemas.microsoft.com/office/word/2016/wordml/cid" xmlns:w16se="http://schemas.microsoft.com/office/word/2015/wordml/symex" xmlns:wpg="http://schemas.microsoft.com/office/word/2010/wordprocessingGroup" xmlns:wpi="http://schemas.microsoft.com/office/word/2010/wordprocessingInk" xmlns:wne="http://schemas.microsoft.com/office/word/2006/wordml" xmlns:wps="http://schemas.microsoft.com/office/word/2010/wordprocessingShape" mc:Ignorable="w14 w15 w16se w16cid wp14">
   <w:p>
     <w:pPr>
@@ -4428,7 +4580,7 @@
 </w:hdr>
 </file>
 
-<file path=word/numbering.xml><?xml version="1.0" encoding="utf-8"?>
+<file path=word\numbering.xml><?xml version="1.0" encoding="utf-8"?>
 <w:numbering xmlns:wpc="http://schemas.microsoft.com/office/word/2010/wordprocessingCanvas" xmlns:cx="http://schemas.microsoft.com/office/drawing/2014/chartex" xmlns:cx1="http://schemas.microsoft.com/office/drawing/2015/9/8/chartex" xmlns:cx2="http://schemas.microsoft.com/office/drawing/2015/10/21/chartex" xmlns:cx3="http://schemas.microsoft.com/office/drawing/2016/5/9/chartex" xmlns:cx4="http://schemas.microsoft.com/office/drawing/2016/5/10/chartex" xmlns:cx5="http://schemas.microsoft.com/office/drawing/2016/5/11/chartex" xmlns:cx6="http://schemas.microsoft.com/office/drawing/2016/5/12/chartex" xmlns:cx7="http://schemas.microsoft.com/office/drawing/2016/5/13/chartex" xmlns:cx8="http://schemas.microsoft.com/office/drawing/2016/5/14/chartex" xmlns:mc="http://schemas.openxmlformats.org/markup-compatibility/2006" xmlns:aink="http://schemas.microsoft.com/office/drawing/2016/ink" xmlns:am3d="http://schemas.microsoft.com/office/drawing/2017/model3d" xmlns:o="urn:schemas-microsoft-com:office:office" xmlns:r="http://schemas.openxmlformats.org/officeDocument/2006/relationships" xmlns:m="http://schemas.openxmlformats.org/officeDocument/2006/math" xmlns:v="urn:schemas-microsoft-com:vml" xmlns:wp14="http://schemas.microsoft.com/office/word/2010/wordprocessingDrawing" xmlns:wp="http://schemas.openxmlformats.org/drawingml/2006/wordprocessingDrawing" xmlns:w10="urn:schemas-microsoft-com:office:word" xmlns:w="http://schemas.openxmlformats.org/wordprocessingml/2006/main" xmlns:w14="http://schemas.microsoft.com/office/word/2010/wordml" xmlns:w15="http://schemas.microsoft.com/office/word/2012/wordml" xmlns:w16cid="http://schemas.microsoft.com/office/word/2016/wordml/cid" xmlns:w16se="http://schemas.microsoft.com/office/word/2015/wordml/symex" xmlns:wpg="http://schemas.microsoft.com/office/word/2010/wordprocessingGroup" xmlns:wpi="http://schemas.microsoft.com/office/word/2010/wordprocessingInk" xmlns:wne="http://schemas.microsoft.com/office/word/2006/wordml" xmlns:wps="http://schemas.microsoft.com/office/word/2010/wordprocessingShape" mc:Ignorable="w14 w15 w16se w16cid wp14">
   <w:abstractNum w:abstractNumId="0" w15:restartNumberingAfterBreak="0">
     <w:nsid w:val="2676237F"/>
@@ -4585,7 +4737,66 @@
 </w:numbering>
 </file>
 
-<file path=word/styles.xml><?xml version="1.0" encoding="utf-8"?>
+<file path=word\settings.xml><?xml version="1.0" encoding="utf-8"?>
+<w:settings xmlns:mc="http://schemas.openxmlformats.org/markup-compatibility/2006" xmlns:o="urn:schemas-microsoft-com:office:office" xmlns:r="http://schemas.openxmlformats.org/officeDocument/2006/relationships" xmlns:m="http://schemas.openxmlformats.org/officeDocument/2006/math" xmlns:v="urn:schemas-microsoft-com:vml" xmlns:w10="urn:schemas-microsoft-com:office:word" xmlns:w="http://schemas.openxmlformats.org/wordprocessingml/2006/main" xmlns:w14="http://schemas.microsoft.com/office/word/2010/wordml" xmlns:w15="http://schemas.microsoft.com/office/word/2012/wordml" xmlns:w16cid="http://schemas.microsoft.com/office/word/2016/wordml/cid" xmlns:w16se="http://schemas.microsoft.com/office/word/2015/wordml/symex" xmlns:sl="http://schemas.openxmlformats.org/schemaLibrary/2006/main" mc:Ignorable="w14 w15 w16se w16cid">
+  <w:zoom w:percent="100"/>
+  <w:displayBackgroundShape/>
+  <w:proofState w:spelling="clean" w:grammar="clean"/>
+  <w:defaultTabStop w:val="720"/>
+  <w:characterSpacingControl w:val="doNotCompress"/>
+  <w:footnotePr>
+    <w:footnote w:id="-1"/>
+    <w:footnote w:id="0"/>
+  </w:footnotePr>
+  <w:endnotePr>
+    <w:endnote w:id="-1"/>
+    <w:endnote w:id="0"/>
+  </w:endnotePr>
+  <w:compat>
+    <w:compatSetting w:name="compatibilityMode" w:uri="http://schemas.microsoft.com/office/word" w:val="15"/>
+    <w:compatSetting w:name="overrideTableStyleFontSizeAndJustification" w:uri="http://schemas.microsoft.com/office/word" w:val="1"/>
+    <w:compatSetting w:name="enableOpenTypeFeatures" w:uri="http://schemas.microsoft.com/office/word" w:val="1"/>
+    <w:compatSetting w:name="doNotFlipMirrorIndents" w:uri="http://schemas.microsoft.com/office/word" w:val="1"/>
+    <w:compatSetting w:name="differentiateMultirowTableHeaders" w:uri="http://schemas.microsoft.com/office/word" w:val="1"/>
+    <w:compatSetting w:name="useWord2013TrackBottomHyphenation" w:uri="http://schemas.microsoft.com/office/word" w:val="1"/>
+  </w:compat>
+  <w:rsids>
+    <w:rsidRoot w:val="00405717"/>
+    <w:rsid w:val="00405717"/>
+    <w:rsid w:val="00622B40"/>
+    <w:rsid w:val="0078008E"/>
+    <w:rsid w:val="00CC1B85"/>
+    <w:rsid w:val="00D6688D"/>
+  </w:rsids>
+  <m:mathPr>
+    <m:mathFont m:val="Cambria Math"/>
+    <m:brkBin m:val="before"/>
+    <m:brkBinSub m:val="--"/>
+    <m:smallFrac m:val="0"/>
+    <m:dispDef/>
+    <m:lMargin m:val="0"/>
+    <m:rMargin m:val="0"/>
+    <m:defJc m:val="centerGroup"/>
+    <m:wrapIndent m:val="1440"/>
+    <m:intLim m:val="subSup"/>
+    <m:naryLim m:val="undOvr"/>
+  </m:mathPr>
+  <w:themeFontLang w:val="en-US"/>
+  <w:clrSchemeMapping w:bg1="light1" w:t1="dark1" w:bg2="light2" w:t2="dark2" w:accent1="accent1" w:accent2="accent2" w:accent3="accent3" w:accent4="accent4" w:accent5="accent5" w:accent6="accent6" w:hyperlink="hyperlink" w:followedHyperlink="followedHyperlink"/>
+  <w:shapeDefaults>
+    <o:shapedefaults v:ext="edit" spidmax="1026"/>
+    <o:shapelayout v:ext="edit">
+      <o:idmap v:ext="edit" data="1"/>
+    </o:shapelayout>
+  </w:shapeDefaults>
+  <w:decimalSymbol w:val="."/>
+  <w:listSeparator w:val=","/>
+  <w14:docId w14:val="30E0D79B"/>
+  <w15:docId w15:val="{31C5824E-12DF-4F92-92E8-4C109B2C3DDF}"/>
+</w:settings>
+</file>
+
+<file path=word\styles.xml><?xml version="1.0" encoding="utf-8"?>
 <w:styles xmlns:mc="http://schemas.openxmlformats.org/markup-compatibility/2006" xmlns:r="http://schemas.openxmlformats.org/officeDocument/2006/relationships" xmlns:w="http://schemas.openxmlformats.org/wordprocessingml/2006/main" xmlns:w14="http://schemas.microsoft.com/office/word/2010/wordml" xmlns:w15="http://schemas.microsoft.com/office/word/2012/wordml" xmlns:w16cid="http://schemas.microsoft.com/office/word/2016/wordml/cid" xmlns:w16se="http://schemas.microsoft.com/office/word/2015/wordml/symex" mc:Ignorable="w14 w15 w16se w16cid">
   <w:docDefaults>
     <w:rPrDefault>
@@ -5231,7 +5442,7 @@
 </w:styles>
 </file>
 
-<file path=word/theme/theme1.xml><?xml version="1.0" encoding="utf-8"?>
+<file path=word\theme\theme1.xml><?xml version="1.0" encoding="utf-8"?>
 <a:theme xmlns:a="http://schemas.openxmlformats.org/drawingml/2006/main" name="Office Theme">
   <a:themeElements>
     <a:clrScheme name="Office">
@@ -5524,4 +5735,8 @@
     </a:ext>
   </a:extLst>
 </a:theme>
+</file>
+
+<file path=word\webSettings.xml><?xml version="1.0" encoding="utf-8"?>
+<w:webSettings xmlns:mc="http://schemas.openxmlformats.org/markup-compatibility/2006" xmlns:r="http://schemas.openxmlformats.org/officeDocument/2006/relationships" xmlns:w="http://schemas.openxmlformats.org/wordprocessingml/2006/main" xmlns:w14="http://schemas.microsoft.com/office/word/2010/wordml" xmlns:w15="http://schemas.microsoft.com/office/word/2012/wordml" xmlns:w16cid="http://schemas.microsoft.com/office/word/2016/wordml/cid" xmlns:w16se="http://schemas.microsoft.com/office/word/2015/wordml/symex" mc:Ignorable="w14 w15 w16se w16cid"/>
 </file>
</xml_diff>